<commit_message>
figma: extra mockups (pricing, app screens, security) described and shown in lab6; SOC 2 decision; reports rebuilt
</commit_message>
<xml_diff>
--- a/ЛР7_Итоговый_отчет/ОТЧЕТ_ЛР7_TableMind.docx
+++ b/ЛР7_Итоговый_отчет/ОТЧЕТ_ЛР7_TableMind.docx
@@ -264,7 +264,7 @@
       <w:r>
         <w:fldChar w:fldCharType="separate"/>
       </w:r>
-      <w:hyperlink w:anchor="_Toc241940007" w:history="1">
+      <w:hyperlink w:anchor="_Toc241941333" w:history="1">
         <w:r>
           <w:rPr>
             <w:rStyle w:val="af"/>
@@ -292,7 +292,7 @@
             <w:noProof/>
             <w:webHidden/>
           </w:rPr>
-          <w:instrText xml:space="preserve"> PAGEREF _Toc241940007 \h </w:instrText>
+          <w:instrText xml:space="preserve"> PAGEREF _Toc241941333 \h </w:instrText>
         </w:r>
         <w:r>
           <w:rPr>
@@ -333,7 +333,7 @@
           <w:noProof/>
         </w:rPr>
       </w:pPr>
-      <w:hyperlink w:anchor="_Toc241940008" w:history="1">
+      <w:hyperlink w:anchor="_Toc241941334" w:history="1">
         <w:r>
           <w:rPr>
             <w:rStyle w:val="af"/>
@@ -395,7 +395,7 @@
             <w:noProof/>
             <w:webHidden/>
           </w:rPr>
-          <w:instrText xml:space="preserve"> PAGEREF _Toc241940008 \h </w:instrText>
+          <w:instrText xml:space="preserve"> PAGEREF _Toc241941334 \h </w:instrText>
         </w:r>
         <w:r>
           <w:rPr>
@@ -436,7 +436,7 @@
           <w:noProof/>
         </w:rPr>
       </w:pPr>
-      <w:hyperlink w:anchor="_Toc241940009" w:history="1">
+      <w:hyperlink w:anchor="_Toc241941335" w:history="1">
         <w:r>
           <w:rPr>
             <w:rStyle w:val="af"/>
@@ -464,7 +464,7 @@
             <w:noProof/>
             <w:webHidden/>
           </w:rPr>
-          <w:instrText xml:space="preserve"> PAGEREF _Toc241940009 \h </w:instrText>
+          <w:instrText xml:space="preserve"> PAGEREF _Toc241941335 \h </w:instrText>
         </w:r>
         <w:r>
           <w:rPr>
@@ -505,7 +505,7 @@
           <w:noProof/>
         </w:rPr>
       </w:pPr>
-      <w:hyperlink w:anchor="_Toc241940010" w:history="1">
+      <w:hyperlink w:anchor="_Toc241941336" w:history="1">
         <w:r>
           <w:rPr>
             <w:rStyle w:val="af"/>
@@ -533,7 +533,7 @@
             <w:noProof/>
             <w:webHidden/>
           </w:rPr>
-          <w:instrText xml:space="preserve"> PAGEREF _Toc241940010 \h </w:instrText>
+          <w:instrText xml:space="preserve"> PAGEREF _Toc241941336 \h </w:instrText>
         </w:r>
         <w:r>
           <w:rPr>
@@ -574,7 +574,7 @@
           <w:noProof/>
         </w:rPr>
       </w:pPr>
-      <w:hyperlink w:anchor="_Toc241940011" w:history="1">
+      <w:hyperlink w:anchor="_Toc241941337" w:history="1">
         <w:r>
           <w:rPr>
             <w:rStyle w:val="af"/>
@@ -602,7 +602,7 @@
             <w:noProof/>
             <w:webHidden/>
           </w:rPr>
-          <w:instrText xml:space="preserve"> PAGEREF _Toc241940011 \h </w:instrText>
+          <w:instrText xml:space="preserve"> PAGEREF _Toc241941337 \h </w:instrText>
         </w:r>
         <w:r>
           <w:rPr>
@@ -643,7 +643,7 @@
           <w:noProof/>
         </w:rPr>
       </w:pPr>
-      <w:hyperlink w:anchor="_Toc241940012" w:history="1">
+      <w:hyperlink w:anchor="_Toc241941338" w:history="1">
         <w:r>
           <w:rPr>
             <w:rStyle w:val="af"/>
@@ -671,7 +671,7 @@
             <w:noProof/>
             <w:webHidden/>
           </w:rPr>
-          <w:instrText xml:space="preserve"> PAGEREF _Toc241940012 \h </w:instrText>
+          <w:instrText xml:space="preserve"> PAGEREF _Toc241941338 \h </w:instrText>
         </w:r>
         <w:r>
           <w:rPr>
@@ -712,7 +712,7 @@
           <w:noProof/>
         </w:rPr>
       </w:pPr>
-      <w:hyperlink w:anchor="_Toc241940013" w:history="1">
+      <w:hyperlink w:anchor="_Toc241941339" w:history="1">
         <w:r>
           <w:rPr>
             <w:rStyle w:val="af"/>
@@ -740,7 +740,7 @@
             <w:noProof/>
             <w:webHidden/>
           </w:rPr>
-          <w:instrText xml:space="preserve"> PAGEREF _Toc241940013 \h </w:instrText>
+          <w:instrText xml:space="preserve"> PAGEREF _Toc241941339 \h </w:instrText>
         </w:r>
         <w:r>
           <w:rPr>
@@ -781,7 +781,7 @@
           <w:noProof/>
         </w:rPr>
       </w:pPr>
-      <w:hyperlink w:anchor="_Toc241940014" w:history="1">
+      <w:hyperlink w:anchor="_Toc241941340" w:history="1">
         <w:r>
           <w:rPr>
             <w:rStyle w:val="af"/>
@@ -809,7 +809,7 @@
             <w:noProof/>
             <w:webHidden/>
           </w:rPr>
-          <w:instrText xml:space="preserve"> PAGEREF _Toc241940014 \h </w:instrText>
+          <w:instrText xml:space="preserve"> PAGEREF _Toc241941340 \h </w:instrText>
         </w:r>
         <w:r>
           <w:rPr>
@@ -850,7 +850,7 @@
           <w:noProof/>
         </w:rPr>
       </w:pPr>
-      <w:hyperlink w:anchor="_Toc241940015" w:history="1">
+      <w:hyperlink w:anchor="_Toc241941341" w:history="1">
         <w:r>
           <w:rPr>
             <w:rStyle w:val="af"/>
@@ -878,7 +878,7 @@
             <w:noProof/>
             <w:webHidden/>
           </w:rPr>
-          <w:instrText xml:space="preserve"> PAGEREF _Toc241940015 \h </w:instrText>
+          <w:instrText xml:space="preserve"> PAGEREF _Toc241941341 \h </w:instrText>
         </w:r>
         <w:r>
           <w:rPr>
@@ -919,7 +919,7 @@
           <w:noProof/>
         </w:rPr>
       </w:pPr>
-      <w:hyperlink w:anchor="_Toc241940016" w:history="1">
+      <w:hyperlink w:anchor="_Toc241941342" w:history="1">
         <w:r>
           <w:rPr>
             <w:rStyle w:val="af"/>
@@ -947,7 +947,7 @@
             <w:noProof/>
             <w:webHidden/>
           </w:rPr>
-          <w:instrText xml:space="preserve"> PAGEREF _Toc241940016 \h </w:instrText>
+          <w:instrText xml:space="preserve"> PAGEREF _Toc241941342 \h </w:instrText>
         </w:r>
         <w:r>
           <w:rPr>
@@ -988,7 +988,7 @@
           <w:noProof/>
         </w:rPr>
       </w:pPr>
-      <w:hyperlink w:anchor="_Toc241940017" w:history="1">
+      <w:hyperlink w:anchor="_Toc241941343" w:history="1">
         <w:r>
           <w:rPr>
             <w:rStyle w:val="af"/>
@@ -1016,7 +1016,7 @@
             <w:noProof/>
             <w:webHidden/>
           </w:rPr>
-          <w:instrText xml:space="preserve"> PAGEREF _Toc241940017 \h </w:instrText>
+          <w:instrText xml:space="preserve"> PAGEREF _Toc241941343 \h </w:instrText>
         </w:r>
         <w:r>
           <w:rPr>
@@ -1057,7 +1057,7 @@
           <w:noProof/>
         </w:rPr>
       </w:pPr>
-      <w:hyperlink w:anchor="_Toc241940018" w:history="1">
+      <w:hyperlink w:anchor="_Toc241941344" w:history="1">
         <w:r>
           <w:rPr>
             <w:rStyle w:val="af"/>
@@ -1085,7 +1085,7 @@
             <w:noProof/>
             <w:webHidden/>
           </w:rPr>
-          <w:instrText xml:space="preserve"> PAGEREF _Toc241940018 \h </w:instrText>
+          <w:instrText xml:space="preserve"> PAGEREF _Toc241941344 \h </w:instrText>
         </w:r>
         <w:r>
           <w:rPr>
@@ -1126,7 +1126,7 @@
           <w:noProof/>
         </w:rPr>
       </w:pPr>
-      <w:hyperlink w:anchor="_Toc241940019" w:history="1">
+      <w:hyperlink w:anchor="_Toc241941345" w:history="1">
         <w:r>
           <w:rPr>
             <w:rStyle w:val="af"/>
@@ -1154,7 +1154,7 @@
             <w:noProof/>
             <w:webHidden/>
           </w:rPr>
-          <w:instrText xml:space="preserve"> PAGEREF _Toc241940019 \h </w:instrText>
+          <w:instrText xml:space="preserve"> PAGEREF _Toc241941345 \h </w:instrText>
         </w:r>
         <w:r>
           <w:rPr>
@@ -1195,7 +1195,7 @@
           <w:noProof/>
         </w:rPr>
       </w:pPr>
-      <w:hyperlink w:anchor="_Toc241940020" w:history="1">
+      <w:hyperlink w:anchor="_Toc241941346" w:history="1">
         <w:r>
           <w:rPr>
             <w:rStyle w:val="af"/>
@@ -1223,7 +1223,7 @@
             <w:noProof/>
             <w:webHidden/>
           </w:rPr>
-          <w:instrText xml:space="preserve"> PAGEREF _Toc241940020 \h </w:instrText>
+          <w:instrText xml:space="preserve"> PAGEREF _Toc241941346 \h </w:instrText>
         </w:r>
         <w:r>
           <w:rPr>
@@ -1264,7 +1264,7 @@
           <w:noProof/>
         </w:rPr>
       </w:pPr>
-      <w:hyperlink w:anchor="_Toc241940021" w:history="1">
+      <w:hyperlink w:anchor="_Toc241941347" w:history="1">
         <w:r>
           <w:rPr>
             <w:rStyle w:val="af"/>
@@ -1292,7 +1292,7 @@
             <w:noProof/>
             <w:webHidden/>
           </w:rPr>
-          <w:instrText xml:space="preserve"> PAGEREF _Toc241940021 \h </w:instrText>
+          <w:instrText xml:space="preserve"> PAGEREF _Toc241941347 \h </w:instrText>
         </w:r>
         <w:r>
           <w:rPr>
@@ -1333,7 +1333,7 @@
           <w:noProof/>
         </w:rPr>
       </w:pPr>
-      <w:hyperlink w:anchor="_Toc241940022" w:history="1">
+      <w:hyperlink w:anchor="_Toc241941348" w:history="1">
         <w:r>
           <w:rPr>
             <w:rStyle w:val="af"/>
@@ -1361,7 +1361,7 @@
             <w:noProof/>
             <w:webHidden/>
           </w:rPr>
-          <w:instrText xml:space="preserve"> PAGEREF _Toc241940022 \h </w:instrText>
+          <w:instrText xml:space="preserve"> PAGEREF _Toc241941348 \h </w:instrText>
         </w:r>
         <w:r>
           <w:rPr>
@@ -1402,7 +1402,7 @@
           <w:noProof/>
         </w:rPr>
       </w:pPr>
-      <w:hyperlink w:anchor="_Toc241940023" w:history="1">
+      <w:hyperlink w:anchor="_Toc241941349" w:history="1">
         <w:r>
           <w:rPr>
             <w:rStyle w:val="af"/>
@@ -1430,7 +1430,7 @@
             <w:noProof/>
             <w:webHidden/>
           </w:rPr>
-          <w:instrText xml:space="preserve"> PAGEREF _Toc241940023 \h </w:instrText>
+          <w:instrText xml:space="preserve"> PAGEREF _Toc241941349 \h </w:instrText>
         </w:r>
         <w:r>
           <w:rPr>
@@ -1471,7 +1471,7 @@
           <w:noProof/>
         </w:rPr>
       </w:pPr>
-      <w:hyperlink w:anchor="_Toc241940024" w:history="1">
+      <w:hyperlink w:anchor="_Toc241941350" w:history="1">
         <w:r>
           <w:rPr>
             <w:rStyle w:val="af"/>
@@ -1499,7 +1499,7 @@
             <w:noProof/>
             <w:webHidden/>
           </w:rPr>
-          <w:instrText xml:space="preserve"> PAGEREF _Toc241940024 \h </w:instrText>
+          <w:instrText xml:space="preserve"> PAGEREF _Toc241941350 \h </w:instrText>
         </w:r>
         <w:r>
           <w:rPr>
@@ -1540,7 +1540,7 @@
           <w:noProof/>
         </w:rPr>
       </w:pPr>
-      <w:hyperlink w:anchor="_Toc241940025" w:history="1">
+      <w:hyperlink w:anchor="_Toc241941351" w:history="1">
         <w:r>
           <w:rPr>
             <w:rStyle w:val="af"/>
@@ -1568,7 +1568,7 @@
             <w:noProof/>
             <w:webHidden/>
           </w:rPr>
-          <w:instrText xml:space="preserve"> PAGEREF _Toc241940025 \h </w:instrText>
+          <w:instrText xml:space="preserve"> PAGEREF _Toc241941351 \h </w:instrText>
         </w:r>
         <w:r>
           <w:rPr>
@@ -1609,7 +1609,7 @@
           <w:noProof/>
         </w:rPr>
       </w:pPr>
-      <w:hyperlink w:anchor="_Toc241940026" w:history="1">
+      <w:hyperlink w:anchor="_Toc241941352" w:history="1">
         <w:r>
           <w:rPr>
             <w:rStyle w:val="af"/>
@@ -1637,7 +1637,7 @@
             <w:noProof/>
             <w:webHidden/>
           </w:rPr>
-          <w:instrText xml:space="preserve"> PAGEREF _Toc241940026 \h </w:instrText>
+          <w:instrText xml:space="preserve"> PAGEREF _Toc241941352 \h </w:instrText>
         </w:r>
         <w:r>
           <w:rPr>
@@ -1683,7 +1683,7 @@
         <w:spacing w:before="0" w:after="360" w:line="360" w:lineRule="exact"/>
         <w:ind w:firstLine="709"/>
       </w:pPr>
-      <w:bookmarkStart w:id="1" w:name="_Toc241940007"/>
+      <w:bookmarkStart w:id="1" w:name="_Toc241941333"/>
       <w:r>
         <w:rPr>
           <w:b/>
@@ -2238,7 +2238,7 @@
         <w:ind w:firstLine="709"/>
       </w:pPr>
       <w:bookmarkStart w:id="2" w:name="_fe8d3efd355b4a528bffe4e412a753a8708d8a7"/>
-      <w:bookmarkStart w:id="3" w:name="_Toc241940008"/>
+      <w:bookmarkStart w:id="3" w:name="_Toc241941334"/>
       <w:bookmarkEnd w:id="0"/>
       <w:r>
         <w:rPr>
@@ -2833,7 +2833,7 @@
         <w:ind w:firstLine="709"/>
       </w:pPr>
       <w:bookmarkStart w:id="4" w:name="_85970216d61dd6d6f40a43c2142d7359aebf30e"/>
-      <w:bookmarkStart w:id="5" w:name="_Toc241940009"/>
+      <w:bookmarkStart w:id="5" w:name="_Toc241941335"/>
       <w:bookmarkEnd w:id="2"/>
       <w:r>
         <w:rPr>
@@ -3549,7 +3549,7 @@
           <w:sz w:val="28"/>
         </w:rPr>
         <w:drawing>
-          <wp:inline distT="0" distB="0" distL="0" distR="0" wp14:anchorId="09AE1FE9" wp14:editId="780AF2CD">
+          <wp:inline distT="0" distB="0" distL="0" distR="0" wp14:anchorId="3D9C93CB" wp14:editId="3ADEB6ED">
             <wp:extent cx="5334000" cy="2471853"/>
             <wp:effectExtent l="0" t="0" r="0" b="0"/>
             <wp:docPr id="12" name="Picture"/>
@@ -3783,7 +3783,7 @@
         <w:ind w:firstLine="709"/>
       </w:pPr>
       <w:bookmarkStart w:id="6" w:name="_952a16116c37bc0383f5f47ccedf9607bd1472f"/>
-      <w:bookmarkStart w:id="7" w:name="_Toc241940010"/>
+      <w:bookmarkStart w:id="7" w:name="_Toc241941336"/>
       <w:bookmarkEnd w:id="4"/>
       <w:r>
         <w:rPr>
@@ -4717,7 +4717,7 @@
         <w:ind w:firstLine="709"/>
       </w:pPr>
       <w:bookmarkStart w:id="8" w:name="_550d58f707a5c37672fca98b77eb8736ae09aa2"/>
-      <w:bookmarkStart w:id="9" w:name="_Toc241940011"/>
+      <w:bookmarkStart w:id="9" w:name="_Toc241941337"/>
       <w:bookmarkEnd w:id="6"/>
       <w:r>
         <w:rPr>
@@ -5260,7 +5260,7 @@
           <w:sz w:val="28"/>
         </w:rPr>
         <w:drawing>
-          <wp:inline distT="0" distB="0" distL="0" distR="0" wp14:anchorId="57119569" wp14:editId="589DCF8F">
+          <wp:inline distT="0" distB="0" distL="0" distR="0" wp14:anchorId="0D1C7652" wp14:editId="17F3E190">
             <wp:extent cx="5334000" cy="2471853"/>
             <wp:effectExtent l="0" t="0" r="0" b="0"/>
             <wp:docPr id="17" name="Picture"/>
@@ -5370,7 +5370,7 @@
         <w:ind w:firstLine="709"/>
       </w:pPr>
       <w:bookmarkStart w:id="10" w:name="_e000447a5cb978ee53bdb6877ec2ece1121f293"/>
-      <w:bookmarkStart w:id="11" w:name="_Toc241940012"/>
+      <w:bookmarkStart w:id="11" w:name="_Toc241941338"/>
       <w:bookmarkEnd w:id="8"/>
       <w:r>
         <w:rPr>
@@ -6125,7 +6125,7 @@
         <w:ind w:firstLine="709"/>
       </w:pPr>
       <w:bookmarkStart w:id="12" w:name="_d6b1e0606ccffbfea524c7b8890d7424ae6ef8d"/>
-      <w:bookmarkStart w:id="13" w:name="_Toc241940013"/>
+      <w:bookmarkStart w:id="13" w:name="_Toc241941339"/>
       <w:bookmarkEnd w:id="10"/>
       <w:r>
         <w:rPr>
@@ -6716,7 +6716,7 @@
         <w:ind w:firstLine="709"/>
       </w:pPr>
       <w:bookmarkStart w:id="14" w:name="_d9c21b914bbc5bab06da79c3c8a3f5937408dab"/>
-      <w:bookmarkStart w:id="15" w:name="_Toc241940014"/>
+      <w:bookmarkStart w:id="15" w:name="_Toc241941340"/>
       <w:bookmarkEnd w:id="12"/>
       <w:r>
         <w:rPr>
@@ -7694,7 +7694,7 @@
         <w:ind w:firstLine="709"/>
       </w:pPr>
       <w:bookmarkStart w:id="16" w:name="_519d46f9ff7923648cbfef21e26057944381813"/>
-      <w:bookmarkStart w:id="17" w:name="_Toc241940015"/>
+      <w:bookmarkStart w:id="17" w:name="_Toc241941341"/>
       <w:bookmarkEnd w:id="14"/>
       <w:r>
         <w:rPr>
@@ -7760,7 +7760,7 @@
         <w:ind w:firstLine="709"/>
       </w:pPr>
       <w:bookmarkStart w:id="18" w:name="_753c3388bf9c3477a7d17f68c6497177eb43643"/>
-      <w:bookmarkStart w:id="19" w:name="_Toc241940016"/>
+      <w:bookmarkStart w:id="19" w:name="_Toc241941342"/>
       <w:bookmarkEnd w:id="16"/>
       <w:r>
         <w:rPr>
@@ -9257,7 +9257,7 @@
         <w:ind w:firstLine="709"/>
       </w:pPr>
       <w:bookmarkStart w:id="20" w:name="_fc51781abcc4857bf621eab6b8861ea54729fed"/>
-      <w:bookmarkStart w:id="21" w:name="_Toc241940017"/>
+      <w:bookmarkStart w:id="21" w:name="_Toc241941343"/>
       <w:bookmarkEnd w:id="18"/>
       <w:r>
         <w:rPr>
@@ -9776,7 +9776,7 @@
           <w:sz w:val="28"/>
         </w:rPr>
         <w:drawing>
-          <wp:inline distT="0" distB="0" distL="0" distR="0" wp14:anchorId="393088CD" wp14:editId="15FCF0E0">
+          <wp:inline distT="0" distB="0" distL="0" distR="0" wp14:anchorId="02210684" wp14:editId="4803A814">
             <wp:extent cx="5334000" cy="2341756"/>
             <wp:effectExtent l="0" t="0" r="0" b="0"/>
             <wp:docPr id="26" name="Picture"/>
@@ -9860,7 +9860,7 @@
         <w:ind w:firstLine="709"/>
       </w:pPr>
       <w:bookmarkStart w:id="22" w:name="_3cbac706be9fcf271e7c81612a5c58063188b2f"/>
-      <w:bookmarkStart w:id="23" w:name="_Toc241940018"/>
+      <w:bookmarkStart w:id="23" w:name="_Toc241941344"/>
       <w:bookmarkEnd w:id="20"/>
       <w:r>
         <w:rPr>
@@ -10802,8 +10802,8 @@
         <w:tblLook w:val="0020" w:firstRow="1" w:lastRow="0" w:firstColumn="0" w:lastColumn="0" w:noHBand="0" w:noVBand="0"/>
       </w:tblPr>
       <w:tblGrid>
-        <w:gridCol w:w="2935"/>
-        <w:gridCol w:w="6420"/>
+        <w:gridCol w:w="2779"/>
+        <w:gridCol w:w="6576"/>
       </w:tblGrid>
       <w:tr>
         <w:trPr>
@@ -10814,7 +10814,7 @@
         </w:trPr>
         <w:tc>
           <w:tcPr>
-            <w:tcW w:w="2935" w:type="dxa"/>
+            <w:tcW w:w="2779" w:type="dxa"/>
             <w:vAlign w:val="center"/>
           </w:tcPr>
           <w:p>
@@ -10834,7 +10834,7 @@
         </w:tc>
         <w:tc>
           <w:tcPr>
-            <w:tcW w:w="6420" w:type="dxa"/>
+            <w:tcW w:w="6575" w:type="dxa"/>
             <w:vAlign w:val="center"/>
           </w:tcPr>
           <w:p>
@@ -10860,7 +10860,7 @@
         </w:trPr>
         <w:tc>
           <w:tcPr>
-            <w:tcW w:w="2935" w:type="dxa"/>
+            <w:tcW w:w="2779" w:type="dxa"/>
             <w:vAlign w:val="center"/>
           </w:tcPr>
           <w:p>
@@ -10879,7 +10879,7 @@
         </w:tc>
         <w:tc>
           <w:tcPr>
-            <w:tcW w:w="6420" w:type="dxa"/>
+            <w:tcW w:w="6575" w:type="dxa"/>
             <w:vAlign w:val="center"/>
           </w:tcPr>
           <w:p>
@@ -10923,7 +10923,7 @@
         </w:trPr>
         <w:tc>
           <w:tcPr>
-            <w:tcW w:w="2935" w:type="dxa"/>
+            <w:tcW w:w="2779" w:type="dxa"/>
             <w:vAlign w:val="center"/>
           </w:tcPr>
           <w:p>
@@ -10942,7 +10942,7 @@
         </w:tc>
         <w:tc>
           <w:tcPr>
-            <w:tcW w:w="6420" w:type="dxa"/>
+            <w:tcW w:w="6575" w:type="dxa"/>
             <w:vAlign w:val="center"/>
           </w:tcPr>
           <w:p>
@@ -10967,7 +10967,7 @@
         </w:trPr>
         <w:tc>
           <w:tcPr>
-            <w:tcW w:w="2935" w:type="dxa"/>
+            <w:tcW w:w="2779" w:type="dxa"/>
             <w:vAlign w:val="center"/>
           </w:tcPr>
           <w:p>
@@ -10986,7 +10986,7 @@
         </w:tc>
         <w:tc>
           <w:tcPr>
-            <w:tcW w:w="6420" w:type="dxa"/>
+            <w:tcW w:w="6575" w:type="dxa"/>
             <w:vAlign w:val="center"/>
           </w:tcPr>
           <w:p>
@@ -11011,7 +11011,7 @@
         </w:trPr>
         <w:tc>
           <w:tcPr>
-            <w:tcW w:w="2935" w:type="dxa"/>
+            <w:tcW w:w="2779" w:type="dxa"/>
             <w:vAlign w:val="center"/>
           </w:tcPr>
           <w:p>
@@ -11030,7 +11030,7 @@
         </w:tc>
         <w:tc>
           <w:tcPr>
-            <w:tcW w:w="6420" w:type="dxa"/>
+            <w:tcW w:w="6575" w:type="dxa"/>
             <w:vAlign w:val="center"/>
           </w:tcPr>
           <w:p>
@@ -11087,7 +11087,7 @@
         </w:trPr>
         <w:tc>
           <w:tcPr>
-            <w:tcW w:w="2935" w:type="dxa"/>
+            <w:tcW w:w="2779" w:type="dxa"/>
             <w:vAlign w:val="center"/>
           </w:tcPr>
           <w:p>
@@ -11106,7 +11106,7 @@
         </w:tc>
         <w:tc>
           <w:tcPr>
-            <w:tcW w:w="6420" w:type="dxa"/>
+            <w:tcW w:w="6575" w:type="dxa"/>
             <w:vAlign w:val="center"/>
           </w:tcPr>
           <w:p>
@@ -11164,26 +11164,27 @@
         </w:trPr>
         <w:tc>
           <w:tcPr>
-            <w:tcW w:w="2935" w:type="dxa"/>
-            <w:vAlign w:val="center"/>
-          </w:tcPr>
-          <w:p>
-            <w:pPr>
-              <w:pStyle w:val="Compact"/>
-              <w:spacing w:before="0" w:after="0" w:line="280" w:lineRule="exact"/>
-              <w:jc w:val="center"/>
-            </w:pPr>
-            <w:r>
-              <w:rPr>
-                <w:sz w:val="24"/>
-              </w:rPr>
+            <w:tcW w:w="2779" w:type="dxa"/>
+            <w:vAlign w:val="center"/>
+          </w:tcPr>
+          <w:p>
+            <w:pPr>
+              <w:pStyle w:val="Compact"/>
+              <w:spacing w:before="0" w:after="0" w:line="280" w:lineRule="exact"/>
+              <w:jc w:val="center"/>
+            </w:pPr>
+            <w:r>
+              <w:rPr>
+                <w:sz w:val="24"/>
+              </w:rPr>
+              <w:lastRenderedPageBreak/>
               <w:t>Предел инвестиций</w:t>
             </w:r>
           </w:p>
         </w:tc>
         <w:tc>
           <w:tcPr>
-            <w:tcW w:w="6420" w:type="dxa"/>
+            <w:tcW w:w="6575" w:type="dxa"/>
             <w:vAlign w:val="center"/>
           </w:tcPr>
           <w:p>
@@ -11248,7 +11249,92 @@
               <w:rPr>
                 <w:sz w:val="24"/>
               </w:rPr>
-              <w:t xml:space="preserve"> - по триггерам риска</w:t>
+              <w:t xml:space="preserve"> - по триггерам риска; </w:t>
+            </w:r>
+            <w:r>
+              <w:rPr>
+                <w:i/>
+                <w:sz w:val="24"/>
+              </w:rPr>
+              <w:t>SOC</w:t>
+            </w:r>
+            <w:r>
+              <w:rPr>
+                <w:sz w:val="24"/>
+              </w:rPr>
+              <w:t xml:space="preserve"> 2 </w:t>
+            </w:r>
+            <w:r>
+              <w:rPr>
+                <w:i/>
+                <w:sz w:val="24"/>
+              </w:rPr>
+              <w:t>Typ</w:t>
+            </w:r>
+            <w:r>
+              <w:rPr>
+                <w:i/>
+                <w:sz w:val="24"/>
+              </w:rPr>
+              <w:t>e</w:t>
+            </w:r>
+            <w:r>
+              <w:rPr>
+                <w:sz w:val="24"/>
+              </w:rPr>
+              <w:t xml:space="preserve"> </w:t>
+            </w:r>
+            <w:r>
+              <w:rPr>
+                <w:i/>
+                <w:sz w:val="24"/>
+              </w:rPr>
+              <w:t>I</w:t>
+            </w:r>
+            <w:r>
+              <w:rPr>
+                <w:sz w:val="24"/>
+              </w:rPr>
+              <w:t xml:space="preserve"> (45-120 тыс. </w:t>
+            </w:r>
+            <w:r>
+              <w:rPr>
+                <w:i/>
+                <w:sz w:val="24"/>
+              </w:rPr>
+              <w:t>BYN</w:t>
+            </w:r>
+            <w:r>
+              <w:rPr>
+                <w:sz w:val="24"/>
+              </w:rPr>
+              <w:t xml:space="preserve">, ЛР6 приложение Г) финансируется из резерва и перераспределения статей, </w:t>
+            </w:r>
+            <w:r>
+              <w:rPr>
+                <w:i/>
+                <w:sz w:val="24"/>
+              </w:rPr>
+              <w:t>Type</w:t>
+            </w:r>
+            <w:r>
+              <w:rPr>
+                <w:sz w:val="24"/>
+              </w:rPr>
+              <w:t xml:space="preserve"> </w:t>
+            </w:r>
+            <w:r>
+              <w:rPr>
+                <w:i/>
+                <w:sz w:val="24"/>
+              </w:rPr>
+              <w:t>II</w:t>
+            </w:r>
+            <w:r>
+              <w:rPr>
+                <w:sz w:val="24"/>
+              </w:rPr>
+              <w:t xml:space="preserve"> - после завершения проекта</w:t>
             </w:r>
           </w:p>
         </w:tc>
@@ -11260,33 +11346,26 @@
         </w:trPr>
         <w:tc>
           <w:tcPr>
-            <w:tcW w:w="2935" w:type="dxa"/>
-            <w:vAlign w:val="center"/>
-          </w:tcPr>
-          <w:p>
-            <w:pPr>
-              <w:pStyle w:val="Compact"/>
-              <w:spacing w:before="0" w:after="0" w:line="280" w:lineRule="exact"/>
-              <w:jc w:val="center"/>
-            </w:pPr>
-            <w:r>
-              <w:rPr>
-                <w:sz w:val="24"/>
-              </w:rPr>
-              <w:lastRenderedPageBreak/>
-              <w:t>Контрольн</w:t>
-            </w:r>
-            <w:r>
-              <w:rPr>
-                <w:sz w:val="24"/>
-              </w:rPr>
-              <w:t>ые метрики</w:t>
-            </w:r>
-          </w:p>
-        </w:tc>
-        <w:tc>
-          <w:tcPr>
-            <w:tcW w:w="6420" w:type="dxa"/>
+            <w:tcW w:w="2779" w:type="dxa"/>
+            <w:vAlign w:val="center"/>
+          </w:tcPr>
+          <w:p>
+            <w:pPr>
+              <w:pStyle w:val="Compact"/>
+              <w:spacing w:before="0" w:after="0" w:line="280" w:lineRule="exact"/>
+              <w:jc w:val="center"/>
+            </w:pPr>
+            <w:r>
+              <w:rPr>
+                <w:sz w:val="24"/>
+              </w:rPr>
+              <w:t>Контрольные метрики</w:t>
+            </w:r>
+          </w:p>
+        </w:tc>
+        <w:tc>
+          <w:tcPr>
+            <w:tcW w:w="6575" w:type="dxa"/>
             <w:vAlign w:val="center"/>
           </w:tcPr>
           <w:p>
@@ -11336,7 +11415,13 @@
         <w:rPr>
           <w:sz w:val="28"/>
         </w:rPr>
-        <w:t xml:space="preserve"> конверсия регистрация - платящий окажется ниже 3 % или доля трафика ниже 0,5 %, резерв бюджета направляется на дополнительные каналы, а цена и сегмент пересматриваются без остановки проекта.</w:t>
+        <w:t xml:space="preserve"> конверсия регистрация - платящий окажется ниже 3 % или доля трафика ниже 0,5 %, резерв бюджета направляется на дополнительные каналы, а цена и с</w:t>
+      </w:r>
+      <w:r>
+        <w:rPr>
+          <w:sz w:val="28"/>
+        </w:rPr>
+        <w:t>егмент пересматриваются без остановки проекта.</w:t>
       </w:r>
     </w:p>
     <w:p>
@@ -11350,13 +11435,7 @@
         <w:rPr>
           <w:sz w:val="28"/>
         </w:rPr>
-        <w:t>Итоговое заключение. По результатам анализа рекомендуется полный</w:t>
-      </w:r>
-      <w:r>
-        <w:rPr>
-          <w:sz w:val="28"/>
-        </w:rPr>
-        <w:t xml:space="preserve"> старт проекта </w:t>
+        <w:t xml:space="preserve">Итоговое заключение. По результатам анализа рекомендуется полный старт проекта </w:t>
       </w:r>
       <w:r>
         <w:rPr>
@@ -11382,7 +11461,13 @@
         <w:rPr>
           <w:sz w:val="28"/>
         </w:rPr>
-        <w:t>-моделей для финансовых специалистов англоязычных стран и ЕС. Основания: проблема подтверждена и массовая; рынок достаточен (</w:t>
+        <w:t>-моделей для финансовых специалистов англоязычных стран и ЕС. Основания: проблема подтве</w:t>
+      </w:r>
+      <w:r>
+        <w:rPr>
+          <w:sz w:val="28"/>
+        </w:rPr>
+        <w:t>рждена и массовая; рынок достаточен (</w:t>
       </w:r>
       <w:r>
         <w:rPr>
@@ -11408,13 +11493,7 @@
         <w:rPr>
           <w:sz w:val="28"/>
         </w:rPr>
-        <w:t xml:space="preserve"> в год) для проверки гипотезы; есть конкурентный п</w:t>
-      </w:r>
-      <w:r>
-        <w:rPr>
-          <w:sz w:val="28"/>
-        </w:rPr>
-        <w:t xml:space="preserve">робел (доказательство вывода, прозрачная цена, отзывы); цена </w:t>
+        <w:t xml:space="preserve"> в год) для проверки гипотезы; есть конкурентный пробел (доказательство вывода, прозрачная цена, отзывы); цена </w:t>
       </w:r>
       <w:r>
         <w:rPr>
@@ -11440,53 +11519,58 @@
         <w:rPr>
           <w:sz w:val="28"/>
         </w:rPr>
-        <w:t xml:space="preserve"> находится в рыночном коридоре. Ключевые риски: цель 50 платящих при базовых допущениях достигает около 19 за 4 месяца платной беты, давление заменителей, зависимость от поиска и </w:t>
+        <w:t xml:space="preserve"> находится в рыночном коридоре. Ключевые риски: цель 50 платящих при базов</w:t>
+      </w:r>
+      <w:r>
+        <w:rPr>
+          <w:sz w:val="28"/>
+        </w:rPr>
+        <w:t xml:space="preserve">ых допущениях достигает около 19 за 4 месяца платной беты, давление заменителей, зависимость от поиска и </w:t>
       </w:r>
       <w:r>
         <w:rPr>
           <w:i/>
           <w:sz w:val="28"/>
         </w:rPr>
-        <w:t>AppSou</w:t>
+        <w:t>AppSource</w:t>
+      </w:r>
+      <w:r>
+        <w:rPr>
+          <w:sz w:val="28"/>
+        </w:rPr>
+        <w:t xml:space="preserve">; способы снижения - дополнительные каналы (партнеры, </w:t>
       </w:r>
       <w:r>
         <w:rPr>
           <w:i/>
           <w:sz w:val="28"/>
         </w:rPr>
-        <w:t>rce</w:t>
-      </w:r>
-      <w:r>
-        <w:rPr>
-          <w:sz w:val="28"/>
-        </w:rPr>
-        <w:t xml:space="preserve">; способы снижения - дополнительные каналы (партнеры, </w:t>
+        <w:t>AppSource</w:t>
+      </w:r>
+      <w:r>
+        <w:rPr>
+          <w:sz w:val="28"/>
+        </w:rPr>
+        <w:t xml:space="preserve">), ранние отзывы и кейсы, измерение конверсий на </w:t>
       </w:r>
       <w:r>
         <w:rPr>
           <w:i/>
           <w:sz w:val="28"/>
         </w:rPr>
-        <w:t>AppSource</w:t>
-      </w:r>
-      <w:r>
-        <w:rPr>
-          <w:sz w:val="28"/>
-        </w:rPr>
-        <w:t xml:space="preserve">), ранние отзывы и кейсы, измерение конверсий на </w:t>
-      </w:r>
-      <w:r>
-        <w:rPr>
-          <w:i/>
-          <w:sz w:val="28"/>
-        </w:rPr>
         <w:t>MVP</w:t>
       </w:r>
       <w:r>
         <w:rPr>
           <w:sz w:val="28"/>
         </w:rPr>
-        <w:t>. Таким образом, запуск целесообразен в полном объеме плана ПЗ1 с перечисленными мерами снижения рисков.</w:t>
+        <w:t>. Таким образом, запуск цел</w:t>
+      </w:r>
+      <w:r>
+        <w:rPr>
+          <w:sz w:val="28"/>
+        </w:rPr>
+        <w:t>есообразен в полном объеме плана ПЗ1 с перечисленными мерами снижения рисков.</w:t>
       </w:r>
     </w:p>
     <w:p>
@@ -11497,7 +11581,7 @@
         <w:ind w:firstLine="709"/>
       </w:pPr>
       <w:bookmarkStart w:id="24" w:name="_efd4e361dc2d7db269a1aa4c2dc9b6b6bcbeef9"/>
-      <w:bookmarkStart w:id="25" w:name="_Toc241940019"/>
+      <w:bookmarkStart w:id="25" w:name="_Toc241941345"/>
       <w:bookmarkEnd w:id="22"/>
       <w:r>
         <w:rPr>
@@ -11505,14 +11589,7 @@
           <w:sz w:val="28"/>
         </w:rPr>
         <w:lastRenderedPageBreak/>
-        <w:t>13 СКВОЗНАЯ ПРОВЕРКА СОГЛАСОВАННО</w:t>
-      </w:r>
-      <w:r>
-        <w:rPr>
-          <w:b/>
-          <w:sz w:val="28"/>
-        </w:rPr>
-        <w:t>СТИ ЧИСЕЛ</w:t>
+        <w:t>13 СКВОЗНАЯ ПРОВЕРКА СОГЛАСОВАННОСТИ ЧИСЕЛ</w:t>
       </w:r>
       <w:bookmarkEnd w:id="25"/>
     </w:p>
@@ -11628,7 +11705,14 @@
                 <w:b/>
                 <w:sz w:val="24"/>
               </w:rPr>
-              <w:t>Результат поиска в отчете</w:t>
+              <w:t>Результа</w:t>
+            </w:r>
+            <w:r>
+              <w:rPr>
+                <w:b/>
+                <w:sz w:val="24"/>
+              </w:rPr>
+              <w:t>т поиска в отчете</w:t>
             </w:r>
           </w:p>
         </w:tc>
@@ -12386,7 +12470,7 @@
         <w:jc w:val="center"/>
       </w:pPr>
       <w:bookmarkStart w:id="26" w:name="_выводы"/>
-      <w:bookmarkStart w:id="27" w:name="_Toc241940020"/>
+      <w:bookmarkStart w:id="27" w:name="_Toc241941346"/>
       <w:bookmarkEnd w:id="24"/>
       <w:r>
         <w:rPr>
@@ -12452,7 +12536,7 @@
         <w:jc w:val="center"/>
       </w:pPr>
       <w:bookmarkStart w:id="28" w:name="_274f6a444530ef90b0479dabf3d210f01e97699"/>
-      <w:bookmarkStart w:id="29" w:name="_Toc241940021"/>
+      <w:bookmarkStart w:id="29" w:name="_Toc241941347"/>
       <w:bookmarkEnd w:id="26"/>
       <w:r>
         <w:rPr>
@@ -12595,7 +12679,7 @@
         <w:ind w:firstLine="709"/>
       </w:pPr>
       <w:bookmarkStart w:id="30" w:name="_d0b2864b05c1a6817d4667f0f3e4b4928a2cf70"/>
-      <w:bookmarkStart w:id="31" w:name="_Toc241940022"/>
+      <w:bookmarkStart w:id="31" w:name="_Toc241941348"/>
       <w:bookmarkEnd w:id="28"/>
       <w:r>
         <w:rPr>
@@ -12618,13 +12702,7 @@
         <w:rPr>
           <w:sz w:val="28"/>
         </w:rPr>
-        <w:t>В таблице 15 предс</w:t>
-      </w:r>
-      <w:r>
-        <w:rPr>
-          <w:sz w:val="28"/>
-        </w:rPr>
-        <w:t>тавлено: паспорт итогового отчета.</w:t>
+        <w:t>В таблице 15 представлено: паспорт итогового отчета.</w:t>
       </w:r>
     </w:p>
     <w:p>
@@ -13361,7 +13439,7 @@
         <w:ind w:firstLine="709"/>
       </w:pPr>
       <w:bookmarkStart w:id="32" w:name="_57b6da660863974cb7f545bcaedf54a886793e9"/>
-      <w:bookmarkStart w:id="33" w:name="_Toc241940023"/>
+      <w:bookmarkStart w:id="33" w:name="_Toc241941349"/>
       <w:bookmarkEnd w:id="30"/>
       <w:r>
         <w:rPr>
@@ -13369,14 +13447,14 @@
           <w:sz w:val="28"/>
         </w:rPr>
         <w:lastRenderedPageBreak/>
-        <w:t>ПРИЛОЖЕНИЕ 2 (ОБЯЗАТЕЛЬНОЕ) КАРТА ДОКАЗАТЕЛЬСТВ ПО</w:t>
+        <w:t xml:space="preserve">ПРИЛОЖЕНИЕ 2 (ОБЯЗАТЕЛЬНОЕ) КАРТА </w:t>
       </w:r>
       <w:r>
         <w:rPr>
           <w:b/>
           <w:sz w:val="28"/>
         </w:rPr>
-        <w:t xml:space="preserve"> РАЗДЕЛАМ</w:t>
+        <w:t>ДОКАЗАТЕЛЬСТВ ПО РАЗДЕЛАМ</w:t>
       </w:r>
       <w:bookmarkEnd w:id="33"/>
     </w:p>
@@ -14463,7 +14541,7 @@
         <w:ind w:firstLine="709"/>
       </w:pPr>
       <w:bookmarkStart w:id="34" w:name="_bab2a73b062d54d30a46b35a66541c275d60dcb"/>
-      <w:bookmarkStart w:id="35" w:name="_Toc241940024"/>
+      <w:bookmarkStart w:id="35" w:name="_Toc241941350"/>
       <w:bookmarkEnd w:id="32"/>
       <w:r>
         <w:rPr>
@@ -14525,9 +14603,9 @@
         <w:tblLook w:val="0020" w:firstRow="1" w:lastRow="0" w:firstColumn="0" w:lastColumn="0" w:noHBand="0" w:noVBand="0"/>
       </w:tblPr>
       <w:tblGrid>
-        <w:gridCol w:w="4100"/>
-        <w:gridCol w:w="1242"/>
-        <w:gridCol w:w="4013"/>
+        <w:gridCol w:w="3817"/>
+        <w:gridCol w:w="1233"/>
+        <w:gridCol w:w="4305"/>
       </w:tblGrid>
       <w:tr>
         <w:trPr>
@@ -14538,7 +14616,7 @@
         </w:trPr>
         <w:tc>
           <w:tcPr>
-            <w:tcW w:w="4100" w:type="dxa"/>
+            <w:tcW w:w="3817" w:type="dxa"/>
             <w:vAlign w:val="center"/>
           </w:tcPr>
           <w:p>
@@ -14558,7 +14636,7 @@
         </w:tc>
         <w:tc>
           <w:tcPr>
-            <w:tcW w:w="1242" w:type="dxa"/>
+            <w:tcW w:w="1233" w:type="dxa"/>
             <w:vAlign w:val="center"/>
           </w:tcPr>
           <w:p>
@@ -14578,7 +14656,7 @@
         </w:tc>
         <w:tc>
           <w:tcPr>
-            <w:tcW w:w="4013" w:type="dxa"/>
+            <w:tcW w:w="4305" w:type="dxa"/>
             <w:vAlign w:val="center"/>
           </w:tcPr>
           <w:p>
@@ -14604,7 +14682,7 @@
         </w:trPr>
         <w:tc>
           <w:tcPr>
-            <w:tcW w:w="4100" w:type="dxa"/>
+            <w:tcW w:w="3817" w:type="dxa"/>
             <w:vAlign w:val="center"/>
           </w:tcPr>
           <w:p>
@@ -14623,7 +14701,7 @@
         </w:tc>
         <w:tc>
           <w:tcPr>
-            <w:tcW w:w="1242" w:type="dxa"/>
+            <w:tcW w:w="1233" w:type="dxa"/>
             <w:vAlign w:val="center"/>
           </w:tcPr>
           <w:p>
@@ -14642,7 +14720,7 @@
         </w:tc>
         <w:tc>
           <w:tcPr>
-            <w:tcW w:w="4013" w:type="dxa"/>
+            <w:tcW w:w="4305" w:type="dxa"/>
             <w:vAlign w:val="center"/>
           </w:tcPr>
           <w:p>
@@ -14667,7 +14745,7 @@
         </w:trPr>
         <w:tc>
           <w:tcPr>
-            <w:tcW w:w="4100" w:type="dxa"/>
+            <w:tcW w:w="3817" w:type="dxa"/>
             <w:vAlign w:val="center"/>
           </w:tcPr>
           <w:p>
@@ -14686,7 +14764,7 @@
         </w:tc>
         <w:tc>
           <w:tcPr>
-            <w:tcW w:w="1242" w:type="dxa"/>
+            <w:tcW w:w="1233" w:type="dxa"/>
             <w:vAlign w:val="center"/>
           </w:tcPr>
           <w:p>
@@ -14705,7 +14783,7 @@
         </w:tc>
         <w:tc>
           <w:tcPr>
-            <w:tcW w:w="4013" w:type="dxa"/>
+            <w:tcW w:w="4305" w:type="dxa"/>
             <w:vAlign w:val="center"/>
           </w:tcPr>
           <w:p>
@@ -14730,7 +14808,7 @@
         </w:trPr>
         <w:tc>
           <w:tcPr>
-            <w:tcW w:w="4100" w:type="dxa"/>
+            <w:tcW w:w="3817" w:type="dxa"/>
             <w:vAlign w:val="center"/>
           </w:tcPr>
           <w:p>
@@ -14749,7 +14827,7 @@
         </w:tc>
         <w:tc>
           <w:tcPr>
-            <w:tcW w:w="1242" w:type="dxa"/>
+            <w:tcW w:w="1233" w:type="dxa"/>
             <w:vAlign w:val="center"/>
           </w:tcPr>
           <w:p>
@@ -14768,7 +14846,7 @@
         </w:tc>
         <w:tc>
           <w:tcPr>
-            <w:tcW w:w="4013" w:type="dxa"/>
+            <w:tcW w:w="4305" w:type="dxa"/>
             <w:vAlign w:val="center"/>
           </w:tcPr>
           <w:p>
@@ -14793,7 +14871,7 @@
         </w:trPr>
         <w:tc>
           <w:tcPr>
-            <w:tcW w:w="4100" w:type="dxa"/>
+            <w:tcW w:w="3817" w:type="dxa"/>
             <w:vAlign w:val="center"/>
           </w:tcPr>
           <w:p>
@@ -14812,7 +14890,7 @@
         </w:tc>
         <w:tc>
           <w:tcPr>
-            <w:tcW w:w="1242" w:type="dxa"/>
+            <w:tcW w:w="1233" w:type="dxa"/>
             <w:vAlign w:val="center"/>
           </w:tcPr>
           <w:p>
@@ -14831,7 +14909,7 @@
         </w:tc>
         <w:tc>
           <w:tcPr>
-            <w:tcW w:w="4013" w:type="dxa"/>
+            <w:tcW w:w="4305" w:type="dxa"/>
             <w:vAlign w:val="center"/>
           </w:tcPr>
           <w:p>
@@ -14856,7 +14934,7 @@
         </w:trPr>
         <w:tc>
           <w:tcPr>
-            <w:tcW w:w="4100" w:type="dxa"/>
+            <w:tcW w:w="3817" w:type="dxa"/>
             <w:vAlign w:val="center"/>
           </w:tcPr>
           <w:p>
@@ -14875,7 +14953,7 @@
         </w:tc>
         <w:tc>
           <w:tcPr>
-            <w:tcW w:w="1242" w:type="dxa"/>
+            <w:tcW w:w="1233" w:type="dxa"/>
             <w:vAlign w:val="center"/>
           </w:tcPr>
           <w:p>
@@ -14894,7 +14972,7 @@
         </w:tc>
         <w:tc>
           <w:tcPr>
-            <w:tcW w:w="4013" w:type="dxa"/>
+            <w:tcW w:w="4305" w:type="dxa"/>
             <w:vAlign w:val="center"/>
           </w:tcPr>
           <w:p>
@@ -14919,32 +14997,26 @@
         </w:trPr>
         <w:tc>
           <w:tcPr>
-            <w:tcW w:w="4100" w:type="dxa"/>
-            <w:vAlign w:val="center"/>
-          </w:tcPr>
-          <w:p>
-            <w:pPr>
-              <w:pStyle w:val="Compact"/>
-              <w:spacing w:before="0" w:after="0" w:line="280" w:lineRule="exact"/>
-              <w:jc w:val="center"/>
-            </w:pPr>
-            <w:r>
-              <w:rPr>
-                <w:sz w:val="24"/>
-              </w:rPr>
-              <w:t>Рыночный стандарт и пробел с</w:t>
-            </w:r>
-            <w:r>
-              <w:rPr>
-                <w:sz w:val="24"/>
-              </w:rPr>
-              <w:t>формулированы явно</w:t>
-            </w:r>
-          </w:p>
-        </w:tc>
-        <w:tc>
-          <w:tcPr>
-            <w:tcW w:w="1242" w:type="dxa"/>
+            <w:tcW w:w="3817" w:type="dxa"/>
+            <w:vAlign w:val="center"/>
+          </w:tcPr>
+          <w:p>
+            <w:pPr>
+              <w:pStyle w:val="Compact"/>
+              <w:spacing w:before="0" w:after="0" w:line="280" w:lineRule="exact"/>
+              <w:jc w:val="center"/>
+            </w:pPr>
+            <w:r>
+              <w:rPr>
+                <w:sz w:val="24"/>
+              </w:rPr>
+              <w:t>Рыночный стандарт и пробел сформулированы явно</w:t>
+            </w:r>
+          </w:p>
+        </w:tc>
+        <w:tc>
+          <w:tcPr>
+            <w:tcW w:w="1233" w:type="dxa"/>
             <w:vAlign w:val="center"/>
           </w:tcPr>
           <w:p>
@@ -14963,7 +15035,7 @@
         </w:tc>
         <w:tc>
           <w:tcPr>
-            <w:tcW w:w="4013" w:type="dxa"/>
+            <w:tcW w:w="4305" w:type="dxa"/>
             <w:vAlign w:val="center"/>
           </w:tcPr>
           <w:p>
@@ -14988,7 +15060,7 @@
         </w:trPr>
         <w:tc>
           <w:tcPr>
-            <w:tcW w:w="4100" w:type="dxa"/>
+            <w:tcW w:w="3817" w:type="dxa"/>
             <w:vAlign w:val="center"/>
           </w:tcPr>
           <w:p>
@@ -15007,7 +15079,7 @@
         </w:tc>
         <w:tc>
           <w:tcPr>
-            <w:tcW w:w="1242" w:type="dxa"/>
+            <w:tcW w:w="1233" w:type="dxa"/>
             <w:vAlign w:val="center"/>
           </w:tcPr>
           <w:p>
@@ -15026,7 +15098,7 @@
         </w:tc>
         <w:tc>
           <w:tcPr>
-            <w:tcW w:w="4013" w:type="dxa"/>
+            <w:tcW w:w="4305" w:type="dxa"/>
             <w:vAlign w:val="center"/>
           </w:tcPr>
           <w:p>
@@ -15051,7 +15123,7 @@
         </w:trPr>
         <w:tc>
           <w:tcPr>
-            <w:tcW w:w="4100" w:type="dxa"/>
+            <w:tcW w:w="3817" w:type="dxa"/>
             <w:vAlign w:val="center"/>
           </w:tcPr>
           <w:p>
@@ -15070,7 +15142,7 @@
         </w:tc>
         <w:tc>
           <w:tcPr>
-            <w:tcW w:w="1242" w:type="dxa"/>
+            <w:tcW w:w="1233" w:type="dxa"/>
             <w:vAlign w:val="center"/>
           </w:tcPr>
           <w:p>
@@ -15089,7 +15161,7 @@
         </w:tc>
         <w:tc>
           <w:tcPr>
-            <w:tcW w:w="4013" w:type="dxa"/>
+            <w:tcW w:w="4305" w:type="dxa"/>
             <w:vAlign w:val="center"/>
           </w:tcPr>
           <w:p>
@@ -15114,7 +15186,7 @@
         </w:trPr>
         <w:tc>
           <w:tcPr>
-            <w:tcW w:w="4100" w:type="dxa"/>
+            <w:tcW w:w="3817" w:type="dxa"/>
             <w:vAlign w:val="center"/>
           </w:tcPr>
           <w:p>
@@ -15133,7 +15205,7 @@
         </w:tc>
         <w:tc>
           <w:tcPr>
-            <w:tcW w:w="1242" w:type="dxa"/>
+            <w:tcW w:w="1233" w:type="dxa"/>
             <w:vAlign w:val="center"/>
           </w:tcPr>
           <w:p>
@@ -15152,7 +15224,7 @@
         </w:tc>
         <w:tc>
           <w:tcPr>
-            <w:tcW w:w="4013" w:type="dxa"/>
+            <w:tcW w:w="4305" w:type="dxa"/>
             <w:vAlign w:val="center"/>
           </w:tcPr>
           <w:p>
@@ -15177,7 +15249,7 @@
         </w:trPr>
         <w:tc>
           <w:tcPr>
-            <w:tcW w:w="4100" w:type="dxa"/>
+            <w:tcW w:w="3817" w:type="dxa"/>
             <w:vAlign w:val="center"/>
           </w:tcPr>
           <w:p>
@@ -15196,7 +15268,7 @@
         </w:tc>
         <w:tc>
           <w:tcPr>
-            <w:tcW w:w="1242" w:type="dxa"/>
+            <w:tcW w:w="1233" w:type="dxa"/>
             <w:vAlign w:val="center"/>
           </w:tcPr>
           <w:p>
@@ -15215,7 +15287,7 @@
         </w:tc>
         <w:tc>
           <w:tcPr>
-            <w:tcW w:w="4013" w:type="dxa"/>
+            <w:tcW w:w="4305" w:type="dxa"/>
             <w:vAlign w:val="center"/>
           </w:tcPr>
           <w:p>
@@ -15240,7 +15312,7 @@
         </w:trPr>
         <w:tc>
           <w:tcPr>
-            <w:tcW w:w="4100" w:type="dxa"/>
+            <w:tcW w:w="3817" w:type="dxa"/>
             <w:vAlign w:val="center"/>
           </w:tcPr>
           <w:p>
@@ -15259,7 +15331,7 @@
         </w:tc>
         <w:tc>
           <w:tcPr>
-            <w:tcW w:w="1242" w:type="dxa"/>
+            <w:tcW w:w="1233" w:type="dxa"/>
             <w:vAlign w:val="center"/>
           </w:tcPr>
           <w:p>
@@ -15278,7 +15350,7 @@
         </w:tc>
         <w:tc>
           <w:tcPr>
-            <w:tcW w:w="4013" w:type="dxa"/>
+            <w:tcW w:w="4305" w:type="dxa"/>
             <w:vAlign w:val="center"/>
           </w:tcPr>
           <w:p>
@@ -15303,7 +15375,7 @@
         </w:trPr>
         <w:tc>
           <w:tcPr>
-            <w:tcW w:w="4100" w:type="dxa"/>
+            <w:tcW w:w="3817" w:type="dxa"/>
             <w:vAlign w:val="center"/>
           </w:tcPr>
           <w:p>
@@ -15322,7 +15394,7 @@
         </w:tc>
         <w:tc>
           <w:tcPr>
-            <w:tcW w:w="1242" w:type="dxa"/>
+            <w:tcW w:w="1233" w:type="dxa"/>
             <w:vAlign w:val="center"/>
           </w:tcPr>
           <w:p>
@@ -15341,7 +15413,7 @@
         </w:tc>
         <w:tc>
           <w:tcPr>
-            <w:tcW w:w="4013" w:type="dxa"/>
+            <w:tcW w:w="4305" w:type="dxa"/>
             <w:vAlign w:val="center"/>
           </w:tcPr>
           <w:p>
@@ -15366,7 +15438,7 @@
         </w:trPr>
         <w:tc>
           <w:tcPr>
-            <w:tcW w:w="4100" w:type="dxa"/>
+            <w:tcW w:w="3817" w:type="dxa"/>
             <w:vAlign w:val="center"/>
           </w:tcPr>
           <w:p>
@@ -15385,7 +15457,7 @@
         </w:tc>
         <w:tc>
           <w:tcPr>
-            <w:tcW w:w="1242" w:type="dxa"/>
+            <w:tcW w:w="1233" w:type="dxa"/>
             <w:vAlign w:val="center"/>
           </w:tcPr>
           <w:p>
@@ -15404,20 +15476,20 @@
         </w:tc>
         <w:tc>
           <w:tcPr>
-            <w:tcW w:w="4013" w:type="dxa"/>
-            <w:vAlign w:val="center"/>
-          </w:tcPr>
-          <w:p>
-            <w:pPr>
-              <w:pStyle w:val="Compact"/>
-              <w:spacing w:before="0" w:after="0" w:line="280" w:lineRule="exact"/>
-              <w:jc w:val="center"/>
-            </w:pPr>
-            <w:r>
-              <w:rPr>
-                <w:sz w:val="24"/>
-              </w:rPr>
-              <w:t xml:space="preserve">покрытие 80 %; прототип сайта в </w:t>
+            <w:tcW w:w="4305" w:type="dxa"/>
+            <w:vAlign w:val="center"/>
+          </w:tcPr>
+          <w:p>
+            <w:pPr>
+              <w:pStyle w:val="Compact"/>
+              <w:spacing w:before="0" w:after="0" w:line="280" w:lineRule="exact"/>
+              <w:jc w:val="center"/>
+            </w:pPr>
+            <w:r>
+              <w:rPr>
+                <w:sz w:val="24"/>
+              </w:rPr>
+              <w:t xml:space="preserve">покрытие 80 % по схемам; прототип в </w:t>
             </w:r>
             <w:r>
               <w:rPr>
@@ -15430,7 +15502,33 @@
               <w:rPr>
                 <w:sz w:val="24"/>
               </w:rPr>
-              <w:t xml:space="preserve"> (3 страницы), экранов приложения нет</w:t>
+              <w:t xml:space="preserve"> охватывает страницы сайта и экраны приложения </w:t>
+            </w:r>
+            <w:r>
+              <w:rPr>
+                <w:i/>
+                <w:sz w:val="24"/>
+              </w:rPr>
+              <w:t>U-001</w:t>
+            </w:r>
+            <w:r>
+              <w:rPr>
+                <w:sz w:val="24"/>
+              </w:rPr>
+              <w:t>…</w:t>
+            </w:r>
+            <w:r>
+              <w:rPr>
+                <w:i/>
+                <w:sz w:val="24"/>
+              </w:rPr>
+              <w:t>U-009</w:t>
+            </w:r>
+            <w:r>
+              <w:rPr>
+                <w:sz w:val="24"/>
+              </w:rPr>
+              <w:t xml:space="preserve"> (демонстрационные данные)</w:t>
             </w:r>
           </w:p>
         </w:tc>
@@ -15442,26 +15540,32 @@
         </w:trPr>
         <w:tc>
           <w:tcPr>
-            <w:tcW w:w="4100" w:type="dxa"/>
-            <w:vAlign w:val="center"/>
-          </w:tcPr>
-          <w:p>
-            <w:pPr>
-              <w:pStyle w:val="Compact"/>
-              <w:spacing w:before="0" w:after="0" w:line="280" w:lineRule="exact"/>
-              <w:jc w:val="center"/>
-            </w:pPr>
-            <w:r>
-              <w:rPr>
-                <w:sz w:val="24"/>
-              </w:rPr>
-              <w:t>Первый релиз отделен от последующих</w:t>
-            </w:r>
-          </w:p>
-        </w:tc>
-        <w:tc>
-          <w:tcPr>
-            <w:tcW w:w="1242" w:type="dxa"/>
+            <w:tcW w:w="3817" w:type="dxa"/>
+            <w:vAlign w:val="center"/>
+          </w:tcPr>
+          <w:p>
+            <w:pPr>
+              <w:pStyle w:val="Compact"/>
+              <w:spacing w:before="0" w:after="0" w:line="280" w:lineRule="exact"/>
+              <w:jc w:val="center"/>
+            </w:pPr>
+            <w:r>
+              <w:rPr>
+                <w:sz w:val="24"/>
+              </w:rPr>
+              <w:t>Перв</w:t>
+            </w:r>
+            <w:r>
+              <w:rPr>
+                <w:sz w:val="24"/>
+              </w:rPr>
+              <w:t>ый релиз отделен от последующих</w:t>
+            </w:r>
+          </w:p>
+        </w:tc>
+        <w:tc>
+          <w:tcPr>
+            <w:tcW w:w="1233" w:type="dxa"/>
             <w:vAlign w:val="center"/>
           </w:tcPr>
           <w:p>
@@ -15480,26 +15584,20 @@
         </w:tc>
         <w:tc>
           <w:tcPr>
-            <w:tcW w:w="4013" w:type="dxa"/>
-            <w:vAlign w:val="center"/>
-          </w:tcPr>
-          <w:p>
-            <w:pPr>
-              <w:pStyle w:val="Compact"/>
-              <w:spacing w:before="0" w:after="0" w:line="280" w:lineRule="exact"/>
-              <w:jc w:val="center"/>
-            </w:pPr>
-            <w:r>
-              <w:rPr>
-                <w:sz w:val="24"/>
-              </w:rPr>
-              <w:t>см. разделы отче</w:t>
-            </w:r>
-            <w:r>
-              <w:rPr>
-                <w:sz w:val="24"/>
-              </w:rPr>
-              <w:t>та</w:t>
+            <w:tcW w:w="4305" w:type="dxa"/>
+            <w:vAlign w:val="center"/>
+          </w:tcPr>
+          <w:p>
+            <w:pPr>
+              <w:pStyle w:val="Compact"/>
+              <w:spacing w:before="0" w:after="0" w:line="280" w:lineRule="exact"/>
+              <w:jc w:val="center"/>
+            </w:pPr>
+            <w:r>
+              <w:rPr>
+                <w:sz w:val="24"/>
+              </w:rPr>
+              <w:t>см. разделы отчета</w:t>
             </w:r>
           </w:p>
         </w:tc>
@@ -15511,7 +15609,7 @@
         </w:trPr>
         <w:tc>
           <w:tcPr>
-            <w:tcW w:w="4100" w:type="dxa"/>
+            <w:tcW w:w="3817" w:type="dxa"/>
             <w:vAlign w:val="center"/>
           </w:tcPr>
           <w:p>
@@ -15530,7 +15628,7 @@
         </w:tc>
         <w:tc>
           <w:tcPr>
-            <w:tcW w:w="1242" w:type="dxa"/>
+            <w:tcW w:w="1233" w:type="dxa"/>
             <w:vAlign w:val="center"/>
           </w:tcPr>
           <w:p>
@@ -15549,7 +15647,7 @@
         </w:tc>
         <w:tc>
           <w:tcPr>
-            <w:tcW w:w="4013" w:type="dxa"/>
+            <w:tcW w:w="4305" w:type="dxa"/>
             <w:vAlign w:val="center"/>
           </w:tcPr>
           <w:p>
@@ -15579,7 +15677,7 @@
         <w:rPr>
           <w:sz w:val="28"/>
         </w:rPr>
-        <w:t xml:space="preserve">Из 15 пунктов 13 выполнены, 2 частично: спрос (расхождение источников) и интерфейсное покрытие (80 %; прототип в </w:t>
+        <w:t xml:space="preserve">Из 15 пунктов 13 выполнены, 2 частично: спрос (расхождение источников) и интерфейсное покрытие (80 % по схемам; макеты </w:t>
       </w:r>
       <w:r>
         <w:rPr>
@@ -15592,7 +15690,7 @@
         <w:rPr>
           <w:sz w:val="28"/>
         </w:rPr>
-        <w:t xml:space="preserve"> охватывает страницы сайта, но не экраны приложения).</w:t>
+        <w:t xml:space="preserve"> покрывают единицы первой версии, но используют демонстрационные данные).</w:t>
       </w:r>
     </w:p>
     <w:p>
@@ -15603,7 +15701,7 @@
         <w:ind w:firstLine="709"/>
       </w:pPr>
       <w:bookmarkStart w:id="36" w:name="_301fb4639e999825c095dd7055019e7c013a803"/>
-      <w:bookmarkStart w:id="37" w:name="_Toc241940025"/>
+      <w:bookmarkStart w:id="37" w:name="_Toc241941351"/>
       <w:bookmarkEnd w:id="34"/>
       <w:r>
         <w:rPr>
@@ -15611,14 +15709,14 @@
           <w:sz w:val="28"/>
         </w:rPr>
         <w:lastRenderedPageBreak/>
-        <w:t>ПРИЛОЖЕНИЕ 4 (ОБЯЗАТЕЛЬНОЕ) МИНИМАЛЬНАЯ ФОРМА ТЕХНИЧЕСКОГО ЗАДАНИЯ ДЛЯ ПЕРВОГО РЕЛИЗ</w:t>
+        <w:t>ПРИЛОЖЕНИЕ 4 (ОБЯЗАТЕЛЬНОЕ) МИНИМАЛЬНАЯ ФОРМА ТЕХНИЧЕСКОГО</w:t>
       </w:r>
       <w:r>
         <w:rPr>
           <w:b/>
           <w:sz w:val="28"/>
         </w:rPr>
-        <w:t>А</w:t>
+        <w:t xml:space="preserve"> ЗАДАНИЯ ДЛЯ ПЕРВОГО РЕЛИЗА</w:t>
       </w:r>
       <w:bookmarkEnd w:id="37"/>
     </w:p>
@@ -15790,7 +15888,13 @@
               <w:rPr>
                 <w:sz w:val="24"/>
               </w:rPr>
-              <w:t>-модель на ошибки и получить отчет с доказательствами</w:t>
+              <w:t xml:space="preserve">-модель на ошибки и получить отчет с </w:t>
+            </w:r>
+            <w:r>
+              <w:rPr>
+                <w:sz w:val="24"/>
+              </w:rPr>
+              <w:t>доказательствами</w:t>
             </w:r>
           </w:p>
         </w:tc>
@@ -16282,7 +16386,7 @@
         <w:ind w:firstLine="709"/>
       </w:pPr>
       <w:bookmarkStart w:id="38" w:name="_0b3889fe5487e8057dd761c90a2747437e007c1"/>
-      <w:bookmarkStart w:id="39" w:name="_Toc241940026"/>
+      <w:bookmarkStart w:id="39" w:name="_Toc241941352"/>
       <w:bookmarkEnd w:id="36"/>
       <w:r>
         <w:rPr>
@@ -16318,13 +16422,7 @@
         <w:rPr>
           <w:sz w:val="28"/>
         </w:rPr>
-        <w:t xml:space="preserve"> в границах онла</w:t>
-      </w:r>
-      <w:r>
-        <w:rPr>
-          <w:sz w:val="28"/>
-        </w:rPr>
-        <w:t xml:space="preserve">йн-проверки </w:t>
+        <w:t xml:space="preserve"> в границах онлайн-проверки </w:t>
       </w:r>
       <w:r>
         <w:rPr>
@@ -16363,13 +16461,13 @@
         <w:rPr>
           <w:sz w:val="28"/>
         </w:rPr>
-        <w:t xml:space="preserve"> в год); опорная проблема подтверждена источниками; ценностное предложе</w:t>
-      </w:r>
-      <w:r>
-        <w:rPr>
-          <w:sz w:val="28"/>
-        </w:rPr>
-        <w:t xml:space="preserve">ние - независимое доказательство находок; единица монетизации - файл, </w:t>
+        <w:t xml:space="preserve"> в год); опорная проблема подтверждена источниками; цен</w:t>
+      </w:r>
+      <w:r>
+        <w:rPr>
+          <w:sz w:val="28"/>
+        </w:rPr>
+        <w:t xml:space="preserve">ностное предложение - независимое доказательство находок; единица монетизации - файл, </w:t>
       </w:r>
       <w:r>
         <w:rPr>
@@ -16408,7 +16506,13 @@
         <w:rPr>
           <w:sz w:val="28"/>
         </w:rPr>
-        <w:t xml:space="preserve"> не ниже 90 % и конверсии регистрация - платящий не ниже 5 %. Запуск целесообразен в полном объеме плана ПЗ1.</w:t>
+        <w:t xml:space="preserve"> не ниже 90 % и конверсии регистрация - п</w:t>
+      </w:r>
+      <w:r>
+        <w:rPr>
+          <w:sz w:val="28"/>
+        </w:rPr>
+        <w:t>латящий не ниже 5 %. Запуск целесообразен в полном объеме плана ПЗ1.</w:t>
       </w:r>
     </w:p>
     <w:bookmarkEnd w:id="38"/>
@@ -16516,7 +16620,7 @@
   <w:abstractNum w:abstractNumId="0" w15:restartNumberingAfterBreak="0">
     <w:nsid w:val="0000A990"/>
     <w:multiLevelType w:val="multilevel"/>
-    <w:tmpl w:val="AE22BBF8"/>
+    <w:tmpl w:val="7FC650C4"/>
     <w:lvl w:ilvl="0">
       <w:numFmt w:val="bullet"/>
       <w:lvlText w:val=" "/>
@@ -16593,7 +16697,7 @@
   <w:abstractNum w:abstractNumId="1" w15:restartNumberingAfterBreak="0">
     <w:nsid w:val="00A99411"/>
     <w:multiLevelType w:val="multilevel"/>
-    <w:tmpl w:val="A7CCA5FA"/>
+    <w:tmpl w:val="F74E0896"/>
     <w:lvl w:ilvl="0">
       <w:start w:val="1"/>
       <w:numFmt w:val="decimal"/>
@@ -18041,7 +18145,7 @@
     <w:autoRedefine/>
     <w:uiPriority w:val="39"/>
     <w:unhideWhenUsed/>
-    <w:rsid w:val="003D0BF5"/>
+    <w:rsid w:val="00F0341B"/>
     <w:pPr>
       <w:spacing w:after="100"/>
     </w:pPr>

</xml_diff>